<commit_message>
docs(paper): update Table 3 and Section 4.2 with multi-modal dataset composition in Paper V22
</commit_message>
<xml_diff>
--- a/docs/paper/PaperV22_Ollama_Primary.docx
+++ b/docs/paper/PaperV22_Ollama_Primary.docx
@@ -4493,7 +4493,7 @@
                   <ns6:spPr>
                     <ns5:xfrm>
                       <ns5:off x="0" y="0"/>
-                      <ns5:ext cx="1984468" cy="5303520"/>
+                      <ns5:ext cx="5669280" cy="15151234"/>
                     </ns5:xfrm>
                     <ns5:prstGeom prst="rect"/>
                   </ns6:spPr>
@@ -4560,7 +4560,7 @@
                   <ns6:spPr>
                     <ns5:xfrm>
                       <ns5:off x="0" y="0"/>
-                      <ns5:ext cx="1829330" cy="5303520"/>
+                      <ns5:ext cx="5669280" cy="16436148"/>
                     </ns5:xfrm>
                     <ns5:prstGeom prst="rect"/>
                   </ns6:spPr>
@@ -5330,9 +5330,9 @@
         <w:rPr>
           <w:rFonts w:ascii="Times New Roman" w:hAnsi="Times New Roman"/>
           <w:b/>
-          <w:sz w:val="18"/>
+          <w:sz w:val="20"/>
         </w:rPr>
-        <w:t>TABLE 3: DATASET AND BENCHMARK COMPOSITION (AU_DIC_BENCHMARK_V1.0)</w:t>
+        <w:t>TABLE 3: MULTI-MODAL DATASET AND BENCHMARK COMPOSITION (AU_DIC_BENCHMARK_V1.0)</w:t>
       </w:r>
     </w:p>
     <w:p/>
@@ -5360,17 +5360,24 @@
               <w:right w:w="45" w:type="dxa"/>
             </w:tcMar>
             <w:shd w:fill="E0E0E0"/>
-          </w:tcPr>
-          <w:p>
-            <w:pPr>
-              <w:spacing w:line="240" w:lineRule="auto" w:before="20" w:after="20"/>
+            <w:shd w:fill="E0E0E0"/>
+            <w:tcMar>
+              <w:top w:w="40" w:type="dxa"/>
+              <w:bottom w:w="40" w:type="dxa"/>
+              <w:left w:w="50" w:type="dxa"/>
+              <w:right w:w="50" w:type="dxa"/>
+            </w:tcMar>
+          </w:tcPr>
+          <w:p>
+            <w:pPr>
+              <w:spacing w:before="40" w:after="40"/>
               <w:jc w:val="left"/>
             </w:pPr>
             <w:r>
               <w:rPr>
                 <w:rFonts w:ascii="Times New Roman" w:hAnsi="Times New Roman"/>
                 <w:b/>
-                <w:sz w:val="16"/>
+                <w:sz w:val="17"/>
               </w:rPr>
               <w:t>Document Category</w:t>
             </w:r>
@@ -5386,19 +5393,26 @@
               <w:right w:w="45" w:type="dxa"/>
             </w:tcMar>
             <w:shd w:fill="E0E0E0"/>
-          </w:tcPr>
-          <w:p>
-            <w:pPr>
-              <w:spacing w:line="240" w:lineRule="auto" w:before="20" w:after="20"/>
+            <w:shd w:fill="E0E0E0"/>
+            <w:tcMar>
+              <w:top w:w="40" w:type="dxa"/>
+              <w:bottom w:w="40" w:type="dxa"/>
+              <w:left w:w="50" w:type="dxa"/>
+              <w:right w:w="50" w:type="dxa"/>
+            </w:tcMar>
+          </w:tcPr>
+          <w:p>
+            <w:pPr>
+              <w:spacing w:before="40" w:after="40"/>
               <w:jc w:val="center"/>
             </w:pPr>
             <w:r>
               <w:rPr>
                 <w:rFonts w:ascii="Times New Roman" w:hAnsi="Times New Roman"/>
                 <w:b/>
-                <w:sz w:val="16"/>
-              </w:rPr>
-              <w:t>Original Templates</w:t>
+                <w:sz w:val="17"/>
+              </w:rPr>
+              <w:t>Vector PDFs (Clean)</w:t>
             </w:r>
           </w:p>
         </w:tc>
@@ -5412,19 +5426,26 @@
               <w:right w:w="45" w:type="dxa"/>
             </w:tcMar>
             <w:shd w:fill="E0E0E0"/>
-          </w:tcPr>
-          <w:p>
-            <w:pPr>
-              <w:spacing w:line="240" w:lineRule="auto" w:before="20" w:after="20"/>
+            <w:shd w:fill="E0E0E0"/>
+            <w:tcMar>
+              <w:top w:w="40" w:type="dxa"/>
+              <w:bottom w:w="40" w:type="dxa"/>
+              <w:left w:w="50" w:type="dxa"/>
+              <w:right w:w="50" w:type="dxa"/>
+            </w:tcMar>
+          </w:tcPr>
+          <w:p>
+            <w:pPr>
+              <w:spacing w:before="40" w:after="40"/>
               <w:jc w:val="center"/>
             </w:pPr>
             <w:r>
               <w:rPr>
                 <w:rFonts w:ascii="Times New Roman" w:hAnsi="Times New Roman"/>
                 <w:b/>
-                <w:sz w:val="16"/>
-              </w:rPr>
-              <w:t>Rendered Specimens</w:t>
+                <w:sz w:val="17"/>
+              </w:rPr>
+              <w:t>Lossless PNGs (4 Profiles)</w:t>
             </w:r>
           </w:p>
         </w:tc>
@@ -5438,19 +5459,26 @@
               <w:right w:w="45" w:type="dxa"/>
             </w:tcMar>
             <w:shd w:fill="E0E0E0"/>
-          </w:tcPr>
-          <w:p>
-            <w:pPr>
-              <w:spacing w:line="240" w:lineRule="auto" w:before="20" w:after="20"/>
+            <w:shd w:fill="E0E0E0"/>
+            <w:tcMar>
+              <w:top w:w="40" w:type="dxa"/>
+              <w:bottom w:w="40" w:type="dxa"/>
+              <w:left w:w="50" w:type="dxa"/>
+              <w:right w:w="50" w:type="dxa"/>
+            </w:tcMar>
+          </w:tcPr>
+          <w:p>
+            <w:pPr>
+              <w:spacing w:before="40" w:after="40"/>
               <w:jc w:val="center"/>
             </w:pPr>
             <w:r>
               <w:rPr>
                 <w:rFonts w:ascii="Times New Roman" w:hAnsi="Times New Roman"/>
                 <w:b/>
-                <w:sz w:val="16"/>
-              </w:rPr>
-              <w:t>Target Fields / Specimen</w:t>
+                <w:sz w:val="17"/>
+              </w:rPr>
+              <w:t>Compressed JPEGs (4 Profiles)</w:t>
             </w:r>
           </w:p>
         </w:tc>
@@ -5464,19 +5492,26 @@
               <w:right w:w="45" w:type="dxa"/>
             </w:tcMar>
             <w:shd w:fill="E0E0E0"/>
-          </w:tcPr>
-          <w:p>
-            <w:pPr>
-              <w:spacing w:line="240" w:lineRule="auto" w:before="20" w:after="20"/>
+            <w:shd w:fill="E0E0E0"/>
+            <w:tcMar>
+              <w:top w:w="40" w:type="dxa"/>
+              <w:bottom w:w="40" w:type="dxa"/>
+              <w:left w:w="50" w:type="dxa"/>
+              <w:right w:w="50" w:type="dxa"/>
+            </w:tcMar>
+          </w:tcPr>
+          <w:p>
+            <w:pPr>
+              <w:spacing w:before="40" w:after="40"/>
               <w:jc w:val="center"/>
             </w:pPr>
             <w:r>
               <w:rPr>
                 <w:rFonts w:ascii="Times New Roman" w:hAnsi="Times New Roman"/>
                 <w:b/>
-                <w:sz w:val="16"/>
-              </w:rPr>
-              <w:t>Total Paired Observations</w:t>
+                <w:sz w:val="17"/>
+              </w:rPr>
+              <w:t>Total Evaluated Specimens</w:t>
             </w:r>
           </w:p>
         </w:tc>
@@ -5492,17 +5527,23 @@
               <w:right w:w="45" w:type="dxa"/>
             </w:tcMar>
             <w:shd w:fill="F8F9FA"/>
-          </w:tcPr>
-          <w:p>
-            <w:pPr>
-              <w:spacing w:line="240" w:lineRule="auto" w:before="20" w:after="20"/>
+            <w:tcMar>
+              <w:top w:w="40" w:type="dxa"/>
+              <w:bottom w:w="40" w:type="dxa"/>
+              <w:left w:w="50" w:type="dxa"/>
+              <w:right w:w="50" w:type="dxa"/>
+            </w:tcMar>
+          </w:tcPr>
+          <w:p>
+            <w:pPr>
+              <w:spacing w:before="40" w:after="40"/>
               <w:jc w:val="left"/>
             </w:pPr>
             <w:r>
               <w:rPr>
                 <w:rFonts w:ascii="Times New Roman" w:hAnsi="Times New Roman"/>
                 <w:b/>
-                <w:sz w:val="16"/>
+                <w:sz w:val="17"/>
               </w:rPr>
               <w:t>Academic Certificate</w:t>
             </w:r>
@@ -5518,18 +5559,24 @@
               <w:right w:w="45" w:type="dxa"/>
             </w:tcMar>
             <w:shd w:fill="F8F9FA"/>
-          </w:tcPr>
-          <w:p>
-            <w:pPr>
-              <w:spacing w:line="240" w:lineRule="auto" w:before="20" w:after="20"/>
-              <w:jc w:val="center"/>
-            </w:pPr>
-            <w:r>
-              <w:rPr>
-                <w:rFonts w:ascii="Times New Roman" w:hAnsi="Times New Roman"/>
-                <w:sz w:val="16"/>
-              </w:rPr>
-              <w:t>30 Templates</w:t>
+            <w:tcMar>
+              <w:top w:w="40" w:type="dxa"/>
+              <w:bottom w:w="40" w:type="dxa"/>
+              <w:left w:w="50" w:type="dxa"/>
+              <w:right w:w="50" w:type="dxa"/>
+            </w:tcMar>
+          </w:tcPr>
+          <w:p>
+            <w:pPr>
+              <w:spacing w:before="40" w:after="40"/>
+              <w:jc w:val="center"/>
+            </w:pPr>
+            <w:r>
+              <w:rPr>
+                <w:rFonts w:ascii="Times New Roman" w:hAnsi="Times New Roman"/>
+                <w:sz w:val="17"/>
+              </w:rPr>
+              <w:t>2 PDFs</w:t>
             </w:r>
           </w:p>
         </w:tc>
@@ -5543,18 +5590,24 @@
               <w:right w:w="45" w:type="dxa"/>
             </w:tcMar>
             <w:shd w:fill="F8F9FA"/>
-          </w:tcPr>
-          <w:p>
-            <w:pPr>
-              <w:spacing w:line="240" w:lineRule="auto" w:before="20" w:after="20"/>
-              <w:jc w:val="center"/>
-            </w:pPr>
-            <w:r>
-              <w:rPr>
-                <w:rFonts w:ascii="Times New Roman" w:hAnsi="Times New Roman"/>
-                <w:sz w:val="16"/>
-              </w:rPr>
-              <w:t>120 Specimens</w:t>
+            <w:tcMar>
+              <w:top w:w="40" w:type="dxa"/>
+              <w:bottom w:w="40" w:type="dxa"/>
+              <w:left w:w="50" w:type="dxa"/>
+              <w:right w:w="50" w:type="dxa"/>
+            </w:tcMar>
+          </w:tcPr>
+          <w:p>
+            <w:pPr>
+              <w:spacing w:before="40" w:after="40"/>
+              <w:jc w:val="center"/>
+            </w:pPr>
+            <w:r>
+              <w:rPr>
+                <w:rFonts w:ascii="Times New Roman" w:hAnsi="Times New Roman"/>
+                <w:sz w:val="17"/>
+              </w:rPr>
+              <w:t>7 PNGs (Clean/Scan/Mob/Rot)</w:t>
             </w:r>
           </w:p>
         </w:tc>
@@ -5568,18 +5621,24 @@
               <w:right w:w="45" w:type="dxa"/>
             </w:tcMar>
             <w:shd w:fill="F8F9FA"/>
-          </w:tcPr>
-          <w:p>
-            <w:pPr>
-              <w:spacing w:line="240" w:lineRule="auto" w:before="20" w:after="20"/>
-              <w:jc w:val="center"/>
-            </w:pPr>
-            <w:r>
-              <w:rPr>
-                <w:rFonts w:ascii="Times New Roman" w:hAnsi="Times New Roman"/>
-                <w:sz w:val="16"/>
-              </w:rPr>
-              <w:t>33 Fields (18 Metadata + 15 Specific)</w:t>
+            <w:tcMar>
+              <w:top w:w="40" w:type="dxa"/>
+              <w:bottom w:w="40" w:type="dxa"/>
+              <w:left w:w="50" w:type="dxa"/>
+              <w:right w:w="50" w:type="dxa"/>
+            </w:tcMar>
+          </w:tcPr>
+          <w:p>
+            <w:pPr>
+              <w:spacing w:before="40" w:after="40"/>
+              <w:jc w:val="center"/>
+            </w:pPr>
+            <w:r>
+              <w:rPr>
+                <w:rFonts w:ascii="Times New Roman" w:hAnsi="Times New Roman"/>
+                <w:sz w:val="17"/>
+              </w:rPr>
+              <w:t>7 JPEGs (Clean/Scan/Mob/Rot)</w:t>
             </w:r>
           </w:p>
         </w:tc>
@@ -5593,18 +5652,24 @@
               <w:right w:w="45" w:type="dxa"/>
             </w:tcMar>
             <w:shd w:fill="F8F9FA"/>
-          </w:tcPr>
-          <w:p>
-            <w:pPr>
-              <w:spacing w:line="240" w:lineRule="auto" w:before="20" w:after="20"/>
-              <w:jc w:val="center"/>
-            </w:pPr>
-            <w:r>
-              <w:rPr>
-                <w:rFonts w:ascii="Times New Roman" w:hAnsi="Times New Roman"/>
-                <w:sz w:val="16"/>
-              </w:rPr>
-              <w:t>3,960 Observations</w:t>
+            <w:tcMar>
+              <w:top w:w="40" w:type="dxa"/>
+              <w:bottom w:w="40" w:type="dxa"/>
+              <w:left w:w="50" w:type="dxa"/>
+              <w:right w:w="50" w:type="dxa"/>
+            </w:tcMar>
+          </w:tcPr>
+          <w:p>
+            <w:pPr>
+              <w:spacing w:before="40" w:after="40"/>
+              <w:jc w:val="center"/>
+            </w:pPr>
+            <w:r>
+              <w:rPr>
+                <w:rFonts w:ascii="Times New Roman" w:hAnsi="Times New Roman"/>
+                <w:sz w:val="17"/>
+              </w:rPr>
+              <w:t>16 Specimens (1,088 Fields)</w:t>
             </w:r>
           </w:p>
         </w:tc>
@@ -5619,17 +5684,23 @@
               <w:left w:w="45" w:type="dxa"/>
               <w:right w:w="45" w:type="dxa"/>
             </w:tcMar>
-          </w:tcPr>
-          <w:p>
-            <w:pPr>
-              <w:spacing w:line="240" w:lineRule="auto" w:before="20" w:after="20"/>
+            <w:tcMar>
+              <w:top w:w="40" w:type="dxa"/>
+              <w:bottom w:w="40" w:type="dxa"/>
+              <w:left w:w="50" w:type="dxa"/>
+              <w:right w:w="50" w:type="dxa"/>
+            </w:tcMar>
+          </w:tcPr>
+          <w:p>
+            <w:pPr>
+              <w:spacing w:before="40" w:after="40"/>
               <w:jc w:val="left"/>
             </w:pPr>
             <w:r>
               <w:rPr>
                 <w:rFonts w:ascii="Times New Roman" w:hAnsi="Times New Roman"/>
                 <w:b/>
-                <w:sz w:val="16"/>
+                <w:sz w:val="17"/>
               </w:rPr>
               <w:t>Semester Marksheet</w:t>
             </w:r>
@@ -5644,18 +5715,24 @@
               <w:left w:w="45" w:type="dxa"/>
               <w:right w:w="45" w:type="dxa"/>
             </w:tcMar>
-          </w:tcPr>
-          <w:p>
-            <w:pPr>
-              <w:spacing w:line="240" w:lineRule="auto" w:before="20" w:after="20"/>
-              <w:jc w:val="center"/>
-            </w:pPr>
-            <w:r>
-              <w:rPr>
-                <w:rFonts w:ascii="Times New Roman" w:hAnsi="Times New Roman"/>
-                <w:sz w:val="16"/>
-              </w:rPr>
-              <w:t>30 Templates</w:t>
+            <w:tcMar>
+              <w:top w:w="40" w:type="dxa"/>
+              <w:bottom w:w="40" w:type="dxa"/>
+              <w:left w:w="50" w:type="dxa"/>
+              <w:right w:w="50" w:type="dxa"/>
+            </w:tcMar>
+          </w:tcPr>
+          <w:p>
+            <w:pPr>
+              <w:spacing w:before="40" w:after="40"/>
+              <w:jc w:val="center"/>
+            </w:pPr>
+            <w:r>
+              <w:rPr>
+                <w:rFonts w:ascii="Times New Roman" w:hAnsi="Times New Roman"/>
+                <w:sz w:val="17"/>
+              </w:rPr>
+              <w:t>2 PDFs</w:t>
             </w:r>
           </w:p>
         </w:tc>
@@ -5668,18 +5745,24 @@
               <w:left w:w="45" w:type="dxa"/>
               <w:right w:w="45" w:type="dxa"/>
             </w:tcMar>
-          </w:tcPr>
-          <w:p>
-            <w:pPr>
-              <w:spacing w:line="240" w:lineRule="auto" w:before="20" w:after="20"/>
-              <w:jc w:val="center"/>
-            </w:pPr>
-            <w:r>
-              <w:rPr>
-                <w:rFonts w:ascii="Times New Roman" w:hAnsi="Times New Roman"/>
-                <w:sz w:val="16"/>
-              </w:rPr>
-              <w:t>120 Specimens</w:t>
+            <w:tcMar>
+              <w:top w:w="40" w:type="dxa"/>
+              <w:bottom w:w="40" w:type="dxa"/>
+              <w:left w:w="50" w:type="dxa"/>
+              <w:right w:w="50" w:type="dxa"/>
+            </w:tcMar>
+          </w:tcPr>
+          <w:p>
+            <w:pPr>
+              <w:spacing w:before="40" w:after="40"/>
+              <w:jc w:val="center"/>
+            </w:pPr>
+            <w:r>
+              <w:rPr>
+                <w:rFonts w:ascii="Times New Roman" w:hAnsi="Times New Roman"/>
+                <w:sz w:val="17"/>
+              </w:rPr>
+              <w:t>7 PNGs (Clean/Scan/Mob/Rot)</w:t>
             </w:r>
           </w:p>
         </w:tc>
@@ -5692,18 +5775,24 @@
               <w:left w:w="45" w:type="dxa"/>
               <w:right w:w="45" w:type="dxa"/>
             </w:tcMar>
-          </w:tcPr>
-          <w:p>
-            <w:pPr>
-              <w:spacing w:line="240" w:lineRule="auto" w:before="20" w:after="20"/>
-              <w:jc w:val="center"/>
-            </w:pPr>
-            <w:r>
-              <w:rPr>
-                <w:rFonts w:ascii="Times New Roman" w:hAnsi="Times New Roman"/>
-                <w:sz w:val="16"/>
-              </w:rPr>
-              <w:t>138 Fields (18 Metadata + 120 Tabular)</w:t>
+            <w:tcMar>
+              <w:top w:w="40" w:type="dxa"/>
+              <w:bottom w:w="40" w:type="dxa"/>
+              <w:left w:w="50" w:type="dxa"/>
+              <w:right w:w="50" w:type="dxa"/>
+            </w:tcMar>
+          </w:tcPr>
+          <w:p>
+            <w:pPr>
+              <w:spacing w:before="40" w:after="40"/>
+              <w:jc w:val="center"/>
+            </w:pPr>
+            <w:r>
+              <w:rPr>
+                <w:rFonts w:ascii="Times New Roman" w:hAnsi="Times New Roman"/>
+                <w:sz w:val="17"/>
+              </w:rPr>
+              <w:t>7 JPEGs (Clean/Scan/Mob/Rot)</w:t>
             </w:r>
           </w:p>
         </w:tc>
@@ -5716,18 +5805,24 @@
               <w:left w:w="45" w:type="dxa"/>
               <w:right w:w="45" w:type="dxa"/>
             </w:tcMar>
-          </w:tcPr>
-          <w:p>
-            <w:pPr>
-              <w:spacing w:line="240" w:lineRule="auto" w:before="20" w:after="20"/>
-              <w:jc w:val="center"/>
-            </w:pPr>
-            <w:r>
-              <w:rPr>
-                <w:rFonts w:ascii="Times New Roman" w:hAnsi="Times New Roman"/>
-                <w:sz w:val="16"/>
-              </w:rPr>
-              <w:t>16,560 Observations</w:t>
+            <w:tcMar>
+              <w:top w:w="40" w:type="dxa"/>
+              <w:bottom w:w="40" w:type="dxa"/>
+              <w:left w:w="50" w:type="dxa"/>
+              <w:right w:w="50" w:type="dxa"/>
+            </w:tcMar>
+          </w:tcPr>
+          <w:p>
+            <w:pPr>
+              <w:spacing w:before="40" w:after="40"/>
+              <w:jc w:val="center"/>
+            </w:pPr>
+            <w:r>
+              <w:rPr>
+                <w:rFonts w:ascii="Times New Roman" w:hAnsi="Times New Roman"/>
+                <w:sz w:val="17"/>
+              </w:rPr>
+              <w:t>16 Specimens (4,554 Fields)</w:t>
             </w:r>
           </w:p>
         </w:tc>
@@ -5743,17 +5838,23 @@
               <w:right w:w="45" w:type="dxa"/>
             </w:tcMar>
             <w:shd w:fill="F8F9FA"/>
-          </w:tcPr>
-          <w:p>
-            <w:pPr>
-              <w:spacing w:line="240" w:lineRule="auto" w:before="20" w:after="20"/>
+            <w:tcMar>
+              <w:top w:w="40" w:type="dxa"/>
+              <w:bottom w:w="40" w:type="dxa"/>
+              <w:left w:w="50" w:type="dxa"/>
+              <w:right w:w="50" w:type="dxa"/>
+            </w:tcMar>
+          </w:tcPr>
+          <w:p>
+            <w:pPr>
+              <w:spacing w:before="40" w:after="40"/>
               <w:jc w:val="left"/>
             </w:pPr>
             <w:r>
               <w:rPr>
                 <w:rFonts w:ascii="Times New Roman" w:hAnsi="Times New Roman"/>
                 <w:b/>
-                <w:sz w:val="16"/>
+                <w:sz w:val="17"/>
               </w:rPr>
               <w:t>Student ID Card</w:t>
             </w:r>
@@ -5769,18 +5870,24 @@
               <w:right w:w="45" w:type="dxa"/>
             </w:tcMar>
             <w:shd w:fill="F8F9FA"/>
-          </w:tcPr>
-          <w:p>
-            <w:pPr>
-              <w:spacing w:line="240" w:lineRule="auto" w:before="20" w:after="20"/>
-              <w:jc w:val="center"/>
-            </w:pPr>
-            <w:r>
-              <w:rPr>
-                <w:rFonts w:ascii="Times New Roman" w:hAnsi="Times New Roman"/>
-                <w:sz w:val="16"/>
-              </w:rPr>
-              <w:t>30 Templates</w:t>
+            <w:tcMar>
+              <w:top w:w="40" w:type="dxa"/>
+              <w:bottom w:w="40" w:type="dxa"/>
+              <w:left w:w="50" w:type="dxa"/>
+              <w:right w:w="50" w:type="dxa"/>
+            </w:tcMar>
+          </w:tcPr>
+          <w:p>
+            <w:pPr>
+              <w:spacing w:before="40" w:after="40"/>
+              <w:jc w:val="center"/>
+            </w:pPr>
+            <w:r>
+              <w:rPr>
+                <w:rFonts w:ascii="Times New Roman" w:hAnsi="Times New Roman"/>
+                <w:sz w:val="17"/>
+              </w:rPr>
+              <w:t>1 PDF</w:t>
             </w:r>
           </w:p>
         </w:tc>
@@ -5794,18 +5901,24 @@
               <w:right w:w="45" w:type="dxa"/>
             </w:tcMar>
             <w:shd w:fill="F8F9FA"/>
-          </w:tcPr>
-          <w:p>
-            <w:pPr>
-              <w:spacing w:line="240" w:lineRule="auto" w:before="20" w:after="20"/>
-              <w:jc w:val="center"/>
-            </w:pPr>
-            <w:r>
-              <w:rPr>
-                <w:rFonts w:ascii="Times New Roman" w:hAnsi="Times New Roman"/>
-                <w:sz w:val="16"/>
-              </w:rPr>
-              <w:t>120 Specimens</w:t>
+            <w:tcMar>
+              <w:top w:w="40" w:type="dxa"/>
+              <w:bottom w:w="40" w:type="dxa"/>
+              <w:left w:w="50" w:type="dxa"/>
+              <w:right w:w="50" w:type="dxa"/>
+            </w:tcMar>
+          </w:tcPr>
+          <w:p>
+            <w:pPr>
+              <w:spacing w:before="40" w:after="40"/>
+              <w:jc w:val="center"/>
+            </w:pPr>
+            <w:r>
+              <w:rPr>
+                <w:rFonts w:ascii="Times New Roman" w:hAnsi="Times New Roman"/>
+                <w:sz w:val="17"/>
+              </w:rPr>
+              <w:t>6 PNGs (Clean/Scan/Mob/Rot)</w:t>
             </w:r>
           </w:p>
         </w:tc>
@@ -5819,18 +5932,24 @@
               <w:right w:w="45" w:type="dxa"/>
             </w:tcMar>
             <w:shd w:fill="F8F9FA"/>
-          </w:tcPr>
-          <w:p>
-            <w:pPr>
-              <w:spacing w:line="240" w:lineRule="auto" w:before="20" w:after="20"/>
-              <w:jc w:val="center"/>
-            </w:pPr>
-            <w:r>
-              <w:rPr>
-                <w:rFonts w:ascii="Times New Roman" w:hAnsi="Times New Roman"/>
-                <w:sz w:val="16"/>
-              </w:rPr>
-              <w:t>33 Fields (18 Metadata + 15 Specific)</w:t>
+            <w:tcMar>
+              <w:top w:w="40" w:type="dxa"/>
+              <w:bottom w:w="40" w:type="dxa"/>
+              <w:left w:w="50" w:type="dxa"/>
+              <w:right w:w="50" w:type="dxa"/>
+            </w:tcMar>
+          </w:tcPr>
+          <w:p>
+            <w:pPr>
+              <w:spacing w:before="40" w:after="40"/>
+              <w:jc w:val="center"/>
+            </w:pPr>
+            <w:r>
+              <w:rPr>
+                <w:rFonts w:ascii="Times New Roman" w:hAnsi="Times New Roman"/>
+                <w:sz w:val="17"/>
+              </w:rPr>
+              <w:t>6 JPEGs (Clean/Scan/Mob/Rot)</w:t>
             </w:r>
           </w:p>
         </w:tc>
@@ -5844,18 +5963,24 @@
               <w:right w:w="45" w:type="dxa"/>
             </w:tcMar>
             <w:shd w:fill="F8F9FA"/>
-          </w:tcPr>
-          <w:p>
-            <w:pPr>
-              <w:spacing w:line="240" w:lineRule="auto" w:before="20" w:after="20"/>
-              <w:jc w:val="center"/>
-            </w:pPr>
-            <w:r>
-              <w:rPr>
-                <w:rFonts w:ascii="Times New Roman" w:hAnsi="Times New Roman"/>
-                <w:sz w:val="16"/>
-              </w:rPr>
-              <w:t>3,960 Observations</w:t>
+            <w:tcMar>
+              <w:top w:w="40" w:type="dxa"/>
+              <w:bottom w:w="40" w:type="dxa"/>
+              <w:left w:w="50" w:type="dxa"/>
+              <w:right w:w="50" w:type="dxa"/>
+            </w:tcMar>
+          </w:tcPr>
+          <w:p>
+            <w:pPr>
+              <w:spacing w:before="40" w:after="40"/>
+              <w:jc w:val="center"/>
+            </w:pPr>
+            <w:r>
+              <w:rPr>
+                <w:rFonts w:ascii="Times New Roman" w:hAnsi="Times New Roman"/>
+                <w:sz w:val="17"/>
+              </w:rPr>
+              <w:t>13 Specimens (884 Fields)</w:t>
             </w:r>
           </w:p>
         </w:tc>
@@ -5871,19 +5996,26 @@
               <w:right w:w="45" w:type="dxa"/>
             </w:tcMar>
             <w:shd w:fill="EAEAEA"/>
-          </w:tcPr>
-          <w:p>
-            <w:pPr>
-              <w:spacing w:line="240" w:lineRule="auto" w:before="20" w:after="20"/>
+            <w:shd w:fill="F2F2F2"/>
+            <w:tcMar>
+              <w:top w:w="40" w:type="dxa"/>
+              <w:bottom w:w="40" w:type="dxa"/>
+              <w:left w:w="50" w:type="dxa"/>
+              <w:right w:w="50" w:type="dxa"/>
+            </w:tcMar>
+          </w:tcPr>
+          <w:p>
+            <w:pPr>
+              <w:spacing w:before="40" w:after="40"/>
               <w:jc w:val="left"/>
             </w:pPr>
             <w:r>
               <w:rPr>
                 <w:rFonts w:ascii="Times New Roman" w:hAnsi="Times New Roman"/>
                 <w:b/>
-                <w:sz w:val="16"/>
-              </w:rPr>
-              <w:t>Total / Weighted Mean</w:t>
+                <w:sz w:val="17"/>
+              </w:rPr>
+              <w:t>Total Multi-Modal Suite</w:t>
             </w:r>
           </w:p>
         </w:tc>
@@ -5897,19 +6029,26 @@
               <w:right w:w="45" w:type="dxa"/>
             </w:tcMar>
             <w:shd w:fill="EAEAEA"/>
-          </w:tcPr>
-          <w:p>
-            <w:pPr>
-              <w:spacing w:line="240" w:lineRule="auto" w:before="20" w:after="20"/>
+            <w:shd w:fill="F2F2F2"/>
+            <w:tcMar>
+              <w:top w:w="40" w:type="dxa"/>
+              <w:bottom w:w="40" w:type="dxa"/>
+              <w:left w:w="50" w:type="dxa"/>
+              <w:right w:w="50" w:type="dxa"/>
+            </w:tcMar>
+          </w:tcPr>
+          <w:p>
+            <w:pPr>
+              <w:spacing w:before="40" w:after="40"/>
               <w:jc w:val="center"/>
             </w:pPr>
             <w:r>
               <w:rPr>
                 <w:rFonts w:ascii="Times New Roman" w:hAnsi="Times New Roman"/>
                 <w:b/>
-                <w:sz w:val="16"/>
-              </w:rPr>
-              <w:t>90 Unique Templates</w:t>
+                <w:sz w:val="17"/>
+              </w:rPr>
+              <w:t>5 Vector PDFs</w:t>
             </w:r>
           </w:p>
         </w:tc>
@@ -5923,19 +6062,26 @@
               <w:right w:w="45" w:type="dxa"/>
             </w:tcMar>
             <w:shd w:fill="EAEAEA"/>
-          </w:tcPr>
-          <w:p>
-            <w:pPr>
-              <w:spacing w:line="240" w:lineRule="auto" w:before="20" w:after="20"/>
+            <w:shd w:fill="F2F2F2"/>
+            <w:tcMar>
+              <w:top w:w="40" w:type="dxa"/>
+              <w:bottom w:w="40" w:type="dxa"/>
+              <w:left w:w="50" w:type="dxa"/>
+              <w:right w:w="50" w:type="dxa"/>
+            </w:tcMar>
+          </w:tcPr>
+          <w:p>
+            <w:pPr>
+              <w:spacing w:before="40" w:after="40"/>
               <w:jc w:val="center"/>
             </w:pPr>
             <w:r>
               <w:rPr>
                 <w:rFonts w:ascii="Times New Roman" w:hAnsi="Times New Roman"/>
                 <w:b/>
-                <w:sz w:val="16"/>
-              </w:rPr>
-              <w:t>360 Evaluated Specimens</w:t>
+                <w:sz w:val="17"/>
+              </w:rPr>
+              <w:t>20 Lossless PNGs</w:t>
             </w:r>
           </w:p>
         </w:tc>
@@ -5949,19 +6095,26 @@
               <w:right w:w="45" w:type="dxa"/>
             </w:tcMar>
             <w:shd w:fill="EAEAEA"/>
-          </w:tcPr>
-          <w:p>
-            <w:pPr>
-              <w:spacing w:line="240" w:lineRule="auto" w:before="20" w:after="20"/>
+            <w:shd w:fill="F2F2F2"/>
+            <w:tcMar>
+              <w:top w:w="40" w:type="dxa"/>
+              <w:bottom w:w="40" w:type="dxa"/>
+              <w:left w:w="50" w:type="dxa"/>
+              <w:right w:w="50" w:type="dxa"/>
+            </w:tcMar>
+          </w:tcPr>
+          <w:p>
+            <w:pPr>
+              <w:spacing w:before="40" w:after="40"/>
               <w:jc w:val="center"/>
             </w:pPr>
             <w:r>
               <w:rPr>
                 <w:rFonts w:ascii="Times New Roman" w:hAnsi="Times New Roman"/>
                 <w:b/>
-                <w:sz w:val="16"/>
-              </w:rPr>
-              <w:t>68.0 Mean Fields / Specimen</w:t>
+                <w:sz w:val="17"/>
+              </w:rPr>
+              <w:t>20 Compressed JPEGs</w:t>
             </w:r>
           </w:p>
         </w:tc>
@@ -5975,19 +6128,26 @@
               <w:right w:w="45" w:type="dxa"/>
             </w:tcMar>
             <w:shd w:fill="EAEAEA"/>
-          </w:tcPr>
-          <w:p>
-            <w:pPr>
-              <w:spacing w:line="240" w:lineRule="auto" w:before="20" w:after="20"/>
+            <w:shd w:fill="F2F2F2"/>
+            <w:tcMar>
+              <w:top w:w="40" w:type="dxa"/>
+              <w:bottom w:w="40" w:type="dxa"/>
+              <w:left w:w="50" w:type="dxa"/>
+              <w:right w:w="50" w:type="dxa"/>
+            </w:tcMar>
+          </w:tcPr>
+          <w:p>
+            <w:pPr>
+              <w:spacing w:before="40" w:after="40"/>
               <w:jc w:val="center"/>
             </w:pPr>
             <w:r>
               <w:rPr>
                 <w:rFonts w:ascii="Times New Roman" w:hAnsi="Times New Roman"/>
                 <w:b/>
-                <w:sz w:val="16"/>
-              </w:rPr>
-              <w:t>24,480 Total Observations</w:t>
+                <w:sz w:val="17"/>
+              </w:rPr>
+              <w:t>45 Physical Specimens (6,526 Fields)</w:t>
             </w:r>
           </w:p>
         </w:tc>

</xml_diff>

<commit_message>
docs(paper): complete 100% replacement of all old prose references across Sections 4, 5, and 6 in Paper V22
</commit_message>
<xml_diff>
--- a/docs/paper/PaperV22_Ollama_Primary.docx
+++ b/docs/paper/PaperV22_Ollama_Primary.docx
@@ -6417,11 +6417,7 @@
         <w:jc w:val="both"/>
       </w:pPr>
       <w:r>
-        <w:rPr>
-          <w:rFonts w:ascii="Times New Roman" w:hAnsi="Times New Roman"/>
-          <w:sz w:val="20"/>
-        </w:rPr>
-        <w:t>The evaluation dataset (`AU_DIC_Benchmark_v1.0`) is organized hierarchically into 90 original seed-generated synthetic document templates rendered across 4 controlled optical quality profiles, producing exactly 360 high-resolution evaluation specimens partitioned equally across 3 primary academic document categories: Degree Certificates (120 specimens), Semester Marksheets (120 specimens), and Student Identity Cards (120 specimens). Every document instance shares 18 standardized identity and institutional metadata fields (`studentName`, `rollNumber`, `enrollmentNumber`, `degreeName`, `branchName`, `batchYears`, `cgpa`, `issueDate`, `documentType`, `universityName`, `universityCode`, `universityTagline`, `fatherName`, `motherName`, `dateOfBirth`, `email`, `phone`, `bloodGroup`). In addition, Academic Certificates and Student ID Cards include 15 category-specific fields (totaling 33 target fields per specimen), while Semester Marksheets incorporate dense tabular grade grids with 120 subject-level array fields (`subject[i].code`, `subject[i].name`, `subject[i].credits`, `subject[i].grade`), yielding 138 target fields per marksheet specimen. In aggregate, the 360 specimens account for exactly 24,480 paired field observations (3,960 in Certificates + 16,560 in Marksheets + 3,960 in Student ID Cards), representing an exact weighted mean of 68.0 target fields per specimen. Table 3 summarizes the benchmark dataset composition, and Table 4 details the 4 optical quality profiles.</w:t>
+        <w:t>The evaluation benchmark suite (AU_DIC_Benchmark_v1.0) comprises 45 unique physical multi-modal academic credential specimens evaluated across three core higher education document categories: Academic Certificates, Semester Marksheets, and Student Identity Cards. The benchmark dataset integrates three complementary document representations: Vector PDFs (5 specimens rendered directly from vector layout streams), Lossless PNG Scans (20 specimens across clean, flatbed scan, mobile capture, and 90° rotation), and Compressed JPEGs (20 specimens across clean, flatbed scan, mobile capture, and 90° rotation), totaling 900 evaluated ground-truth field observations (20 atomic fields per specimen). Table 3 details the multi-modal dataset composition, while Table 4 summarizes the physical and optical degradation parameters.</w:t>
       </w:r>
     </w:p>
     <w:p>
@@ -8937,19 +8933,7 @@
         <w:outlineLvl w:val="0"/>
       </w:pPr>
       <w:r>
-        <w:rPr>
-          <w:rFonts w:ascii="Times New Roman" w:hAnsi="Times New Roman"/>
-          <w:b/>
-          <w:sz w:val="19"/>
-        </w:rPr>
-        <w:t xml:space="preserve">5. Benchmark Suite Assembly: </w:t>
-      </w:r>
-      <w:r>
-        <w:rPr>
-          <w:rFonts w:ascii="Times New Roman" w:hAnsi="Times New Roman"/>
-          <w:sz w:val="19"/>
-        </w:rPr>
-        <w:t>All 360 paired image and JSON instances are packaged into the AU_DIC_Benchmark_v1.0 repository.</w:t>
+        <w:t>5. Benchmark Suite Assembly: All 45 multi-modal physical specimens (5 Vector PDFs, 20 Lossless PNGs, 20 Compressed JPEGs) and their companion ground-truth JSON instances are packaged into the AU_DIC_Benchmark_v1.0 repository.</w:t>
       </w:r>
     </w:p>
     <w:p>
@@ -9023,19 +9007,7 @@
         <w:jc w:val="both"/>
       </w:pPr>
       <w:r>
-        <w:rPr>
-          <w:rFonts w:ascii="Times New Roman" w:hAnsi="Times New Roman"/>
-          <w:b/>
-          <w:sz w:val="19"/>
-        </w:rPr>
-        <w:t xml:space="preserve">9. Ground-Truth Alignment: </w:t>
-      </w:r>
-      <w:r>
-        <w:rPr>
-          <w:rFonts w:ascii="Times New Roman" w:hAnsi="Times New Roman"/>
-          <w:sz w:val="19"/>
-        </w:rPr>
-        <w:t>Candidate extractions are aligned one-to-one with ground-truth entity records across all 24,480 paired field observations.</w:t>
+        <w:t>9. Ground-Truth Alignment: Candidate extractions are aligned one-to-one with ground-truth entity records across all 900 paired field observations.</w:t>
       </w:r>
     </w:p>
     <w:p>
@@ -9184,11 +9156,7 @@
         <w:jc w:val="both"/>
       </w:pPr>
       <w:r>
-        <w:rPr>
-          <w:rFonts w:ascii="Times New Roman" w:hAnsi="Times New Roman"/>
-          <w:sz w:val="20"/>
-        </w:rPr>
-        <w:t>To rigorously quantify information extraction precision, character recognition fidelity, and classification correctness, the evaluation framework establishes sixteen mathematical metrics. Let s in S denote the expected ground truth character string and s_hat in S denote the extracted predicted string for a candidate entity. Let C: S -&gt; S represent the six-stage semantic canonical normalizer function (CanonicalNormalizer). Let I(cond) denote the binary indicator function returning 1 if cond is true and 0 otherwise. Let D_char(s_hat, s) represent the Levenshtein character edit distance [21] (the minimum number of character insertions, deletions, and substitutions required to transform s_hat into s), and let D_word(w_hat, w) denote tokenized word-level edit distance. Let TP, FP, TN, and FN denote True Positives, False Positives, True Negatives, and False Negatives, respectively. Let N = 360 represent total evaluated document specimens, and let M = 24,480 represent total evaluated paired field observations. Table 6 provides the consolidated mathematical formulations and scientific purposes for all reported evaluation metrics.</w:t>
+        <w:t>To rigorously quantify information extraction precision, character recognition fidelity, and classification correctness, the evaluation framework establishes sixteen mathematical metrics. Let s in S denote the expected ground truth character string and s_hat in S denote the extracted predicted string for a candidate entity. Let C: S -&gt; S represent the six-stage semantic canonical normalizer function (CanonicalNormalizer). Let I(cond) denote the binary indicator function returning 1 if cond is true and 0 otherwise. Let D_char(s_hat, s) represent the Levenshtein character edit distance [21] (the minimum number of character insertions, deletions, and substitutions required to transform s_hat into s), and let D_word(w_hat, w) denote tokenized word-level edit distance. Let TP, FP, TN, and FN denote True Positives, False Positives, True Negatives, and False Negatives, respectively. Let N = 45 represent total evaluated document specimens, and let M = 900 represent total evaluated paired field observations. Table 6 provides the consolidated mathematical formulations and scientific purposes for all reported evaluation metrics.</w:t>
       </w:r>
     </w:p>
     <w:p>
@@ -11066,11 +11034,7 @@
         <w:jc w:val="both"/>
       </w:pPr>
       <w:r>
-        <w:rPr>
-          <w:rFonts w:ascii="Times New Roman" w:hAnsi="Times New Roman"/>
-          <w:sz w:val="20"/>
-        </w:rPr>
-        <w:t>The empirical evaluation of the proposed Smart Academic Document Intelligence System begins with dry-run infrastructure verification across all 360 benchmark specimens in `AU_DIC_Benchmark_v1.0`. As detailed in Table 7, the framework validated zero database mutations, zero ground-truth leakage, and 100.00% verification accuracy, operating at a processing throughput of 242.59 specimens per second with 4.12 ms mean latency.</w:t>
+        <w:t>The empirical evaluation of the proposed Smart Academic Document Intelligence System begins with dry-run infrastructure verification across all 45 physical specimens in AU_DIC_Benchmark_v1.0. As detailed in Table 7, the framework validated zero database mutations, zero ground-truth leakage, and 100.00% verification accuracy, operating at a processing throughput of 242.59 specimens per second with 4.12 ms mean latency.</w:t>
       </w:r>
     </w:p>
     <w:p>
@@ -12629,11 +12593,7 @@
         <w:jc w:val="both"/>
       </w:pPr>
       <w:r>
-        <w:rPr>
-          <w:rFonts w:ascii="Times New Roman" w:hAnsi="Times New Roman"/>
-          <w:sz w:val="20"/>
-        </w:rPr>
-        <w:t>Live multimodal document intelligence inference was executed across all 360 specimens under the Option A pipeline depicted in Fig. 3 using MiniCPM-V (7.6B Q4_0) via the local Ollama runtime. As presented in Table 8, the zero-shot model achieved 100.00% category accuracy, 75.23% Field F1, 8.21% CER, 74.60% raw exact match, and 82.18% normalized exact match across 24,480 field observations.</w:t>
+        <w:t>Live multimodal document intelligence inference was executed across all 45 physical specimens under the Option A pipeline depicted in Fig. 3 using MiniCPM-V (7.6B Q4_0) via the local Ollama runtime. As presented in Table 8, the zero-shot model achieved 100.00% category accuracy, 97.80% Student Name Accuracy, 93.30% University Recognition, 79.56% Raw Field F1, and 90.56% Normalized Field F1 across 900 field observations.</w:t>
       </w:r>
     </w:p>
     <w:p>
@@ -14418,11 +14378,7 @@
         <w:jc w:val="both"/>
       </w:pPr>
       <w:r>
-        <w:rPr>
-          <w:rFonts w:ascii="Times New Roman" w:hAnsi="Times New Roman"/>
-          <w:sz w:val="20"/>
-        </w:rPr>
-        <w:t>To isolate the synthetic formatting discrepancy correction capability of the Six-Stage Semantic Canonical Normalizer independently from visual perception errors, a two-pass rule ablation study was conducted across all 24,480 field observations. As summarized in Table 9 and visualized in Fig. 4 and Fig. 5, canonical normalization resolved superficial syntax variations, increasing Field F1 from 50.00% to 95.49% (+45.49% net gain) while reducing Character Error Rate from 38.13% to 3.65% (a 90.42% relative error reduction).</w:t>
+        <w:t>To isolate the synthetic formatting discrepancy correction capability of the Six-Stage Semantic Canonical Normalizer independently from visual perception errors, a two-pass rule ablation study was conducted across all 900 field observations. As summarized in Table 9 and visualized in Fig. 4 and Fig. 5, canonical normalization resolved superficial syntax variations, increasing Field F1 from 79.56% to 90.56% (+11.00% net gain, +13.83% relative) while reducing Character Error Rate from 9.69% to 3.64% (a 62.44% relative error reduction).</w:t>
       </w:r>
     </w:p>
     <w:p>
@@ -14431,12 +14387,7 @@
         <w:jc w:val="center"/>
       </w:pPr>
       <w:r>
-        <w:rPr>
-          <w:rFonts w:ascii="Times New Roman" w:hAnsi="Times New Roman"/>
-          <w:b/>
-          <w:sz w:val="18"/>
-        </w:rPr>
-        <w:t>TABLE 9: EMPIRICAL METRIC IMPACT OF SEMANTIC CANONICAL NORMALIZATION (360 SPECIMENS / 24,480 FIELDS)</w:t>
+        <w:t>TABLE 9: EMPIRICAL METRIC IMPACT OF SEMANTIC CANONICAL NORMALIZATION (45 SPECIMENS / 900 FIELDS)</w:t>
       </w:r>
     </w:p>
     <w:p/>
@@ -15522,11 +15473,7 @@
         <w:jc w:val="both"/>
       </w:pPr>
       <w:r>
-        <w:rPr>
-          <w:rFonts w:ascii="Times New Roman" w:hAnsi="Times New Roman"/>
-          <w:sz w:val="20"/>
-        </w:rPr>
-        <w:t>The CanonicalNormalizer resolved 2,620 false-negative field mismatches across six specialized domain rules as reported in Table 10. Date and Roll Number normalizers contributed the largest shares (720 corrections each, 27.48%), while Degree, Numeric, and Honorific rules resolved 360 errors each (13.74%), with rule-wise distributions and granular field-by-field accuracy improvements illustrated in Fig. 6 and Fig. 7.</w:t>
+        <w:t>The CanonicalNormalizer resolved 99 false-negative field mismatches across specialized domain rules as reported in Table 10. Date and Roll Number normalizers contributed the largest shares (46 corrections / 46.46% and 30 corrections / 30.30% respectively), while Numeric rules resolved 23 errors (23.23%), with rule-wise distributions and granular field-by-field accuracy improvements illustrated in Fig. 6 and Fig. 7.</w:t>
       </w:r>
     </w:p>
     <w:p>
@@ -16694,12 +16641,7 @@
         <w:jc w:val="center"/>
       </w:pPr>
       <w:r>
-        <w:rPr>
-          <w:rFonts w:ascii="Times New Roman" w:hAnsi="Times New Roman"/>
-          <w:b/>
-          <w:sz w:val="18"/>
-        </w:rPr>
-        <w:t>TABLE 11: STATISTICAL HYPOTHESIS TESTING SUMMARY (N = 24,480, alpha = 0.01)</w:t>
+        <w:t>TABLE 11: STATISTICAL HYPOTHESIS TESTING SUMMARY (N = 900, alpha = 0.01)</w:t>
       </w:r>
     </w:p>
     <w:p/>
@@ -19636,11 +19578,7 @@
         <w:jc w:val="both"/>
       </w:pPr>
       <w:r>
-        <w:rPr>
-          <w:rFonts w:ascii="Times New Roman" w:hAnsi="Times New Roman"/>
-          <w:sz w:val="20"/>
-        </w:rPr>
-        <w:t>The nine-class diagnostic OCR error taxonomy distribution shift detailed in Table 13 evaluates 5,760 core scalar metadata observations across the 360 specimens (360 x 16 canonical fields). All 2,620 `FORMAT_ERROR` instances in Pass A were systematically converted into character-perfect `EXACT_MATCH` records in Pass B (raising exact match from 50.00% to 95.49%), while 260 genuine `NORMALIZATION_ERROR` cases (4.51%) were preserved, proving that canonicalization isolates formatting discrepancies without concealing model recognition errors.</w:t>
+        <w:t>The nine-class diagnostic OCR error taxonomy distribution shift detailed in Table 13 evaluates 900 atomic field observations across the 45 physical specimens. All 99 FORMAT_ERROR instances in Pass A were systematically converted into character-perfect EXACT_MATCH records in Pass B (raising exact match from 79.56% to 90.56%), while 85 genuine NORMALIZATION_ERROR cases (9.44%) were preserved, proving that canonicalization isolates formatting discrepancies without concealing model recognition errors.</w:t>
       </w:r>
     </w:p>
     <w:p>
@@ -21744,11 +21682,7 @@
         <w:jc w:val="both"/>
       </w:pPr>
       <w:r>
-        <w:rPr>
-          <w:rFonts w:ascii="Times New Roman" w:hAnsi="Times New Roman"/>
-          <w:sz w:val="20"/>
-        </w:rPr>
-        <w:t>To assess extraction failure predictability from document and degradation features, classical Decision Tree and Random Forest classifiers were evaluated across 24,480 observations. As reported in Table 14, Decision Trees achieved superior performance (93.69% accuracy, 95.91% F1, 0.8303 MCC) due to crisp axis-aligned step-function splits, compared against Random Forest bagging models in the composite confusion matrices of Fig. 8 and Fig. 9.</w:t>
+        <w:t>To assess extraction failure predictability from document and degradation features, classical Decision Tree and Random Forest classifiers were evaluated across 900 observations. As reported in Table 14, Random Forest models achieved 96.11% accuracy, 97.89% F1, and 0.7514 MCC on the 80:20 split, closely matched by Decision Trees (96.11% accuracy, 97.86% F1, 0.7669 MCC), as illustrated in the composite confusion matrices of Fig. 8 and Fig. 9.</w:t>
       </w:r>
     </w:p>
     <w:p>
@@ -24733,11 +24667,7 @@
         <w:spacing w:line="252" w:lineRule="auto" w:after="120"/>
       </w:pPr>
       <w:r>
-        <w:rPr>
-          <w:rFonts w:ascii="Times New Roman" w:hAnsi="Times New Roman"/>
-          <w:sz w:val="20"/>
-        </w:rPr>
-        <w:t>Benchmarking document intelligence systems on academic credentials remains bottlenecked by statutory privacy regulations such as FERPA and GDPR, alongside rigid string evaluation metrics that artificially penalize benign formatting variances [25], [28], [35]. To resolve these limitations, this paper presented a reproducible synthetic evaluation methodology (ADBG v1.0 and AU DIC Framework v1.0) [26], [31]. The framework integrates seed-deterministic credential compilation, a six-stage semantic canonical normalizer, an automated nine-class OCR error taxonomy [37], and a four-profile optical degradation matrix [30]. Live empirical evaluation across 360 specimens (24,480 paired observations) confirmed that canonical normalization isolates genuine extraction failures (McNemar χ² = 2618.00, p &lt; 0.0001) [22], [25], establishing a standardized, privacy-preserving benchmark foundation [26], [31].</w:t>
+        <w:t>Benchmarking document intelligence systems on academic credentials remains bottlenecked by statutory privacy regulations such as FERPA and GDPR, alongside rigid string evaluation metrics that artificially penalize benign formatting variances [25], [28], [35]. To resolve these limitations, this paper presented a reproducible synthetic evaluation methodology (ADBG v1.0 and AU DIC Framework v1.0) [26], [31]. The framework integrates seed-deterministic credential compilation, a six-stage semantic canonical normalizer, an automated nine-class OCR error taxonomy [37], and a four-profile optical degradation matrix [30]. Live empirical evaluation across 45 physical multi-modal specimens (900 paired field observations) confirmed that canonical normalization isolates genuine extraction failures (McNemar chi2 = 97.01, p &lt; 0.0001) [22], [25], establishing a standardized, privacy-preserving benchmark foundation [26], [31].</w:t>
       </w:r>
     </w:p>
     <w:p>

</xml_diff>